<commit_message>
docs: update brand kit — add cyan AI color, three-color semantic system, doc sync rule
Added to TRANSFORMR-Brand-Identity-Kit.docx:
- Tertiary Brand Color: Cyan AI Core #06B6D4
- Semantic Color Language (Purple/Pink/Cyan three-color system)
- AI Brand Gradients (Cyan→Purple)
- Mandatory Brand Documentation Rule

Co-Authored-By: Claude Opus 4.6 <noreply@anthropic.com>
</commit_message>
<xml_diff>
--- a/apps/mobile/TRANSFORMR-Brand-Identity-Kit.docx
+++ b/apps/mobile/TRANSFORMR-Brand-Identity-Kit.docx
@@ -10923,6 +10923,113 @@
           <w:szCs w:val="16"/>
         </w:rPr>
         <w:t>Confidential. Do not distribute without authorization.</w:t>
+      </w:r>
+    </w:p>
+    <w:p>
+      <w:r>
+        <w:br w:type="page"/>
+      </w:r>
+    </w:p>
+    <w:p>
+      <w:pPr>
+        <w:pStyle w:val="Heading2"/>
+      </w:pPr>
+      <w:r>
+        <w:t>TERTIARY BRAND COLOR — AI CORE CYAN</w:t>
+      </w:r>
+    </w:p>
+    <w:p>
+      <w:r>
+        <w:rPr>
+          <w:b/>
+        </w:rPr>
+        <w:t>Cyan AI Core    #06B6D4    All AI-powered features</w:t>
+      </w:r>
+    </w:p>
+    <w:p>
+      <w:r>
+        <w:t>The cyan color is derived from the glowing core of the TRANSFORMR prismatic mark. It represents the AI intelligence at the heart of the platform — Claude thinking, analyzing, and generating insights for the user.</w:t>
+      </w:r>
+    </w:p>
+    <w:p/>
+    <w:p>
+      <w:pPr>
+        <w:pStyle w:val="Heading3"/>
+      </w:pPr>
+      <w:r>
+        <w:t>SEMANTIC COLOR LANGUAGE (Three-Color System)</w:t>
+      </w:r>
+    </w:p>
+    <w:p>
+      <w:r>
+        <w:t>Purple #A855F7 — Structure. Navigation. Primary actions.</w:t>
+      </w:r>
+    </w:p>
+    <w:p>
+      <w:r>
+        <w:t>Pink   #EC4899 — Celebration. Achievement. Energy. (Expanded beyond couples features — now used for PRs, milestones, and all achievement moments.)</w:t>
+      </w:r>
+    </w:p>
+    <w:p>
+      <w:r>
+        <w:t>Cyan   #06B6D4 — Intelligence. AI. Data insights. (New — used on all AI-powered features to signal Claude is working.)</w:t>
+      </w:r>
+    </w:p>
+    <w:p/>
+    <w:p>
+      <w:pPr>
+        <w:pStyle w:val="Heading3"/>
+      </w:pPr>
+      <w:r>
+        <w:t>AI BRAND GRADIENTS (New)</w:t>
+      </w:r>
+    </w:p>
+    <w:p>
+      <w:r>
+        <w:t>Cyan → Purple (#06B6D4 to #A855F7): Used on AI feature buttons, AI coach interface, readiness scores, and any element that surfaces AI-generated content. Direction: left-to-right.</w:t>
+      </w:r>
+    </w:p>
+    <w:p/>
+    <w:p>
+      <w:pPr>
+        <w:pStyle w:val="Heading3"/>
+      </w:pPr>
+      <w:r>
+        <w:t>MANDATORY BRAND DOCUMENTATION RULE</w:t>
+      </w:r>
+    </w:p>
+    <w:p>
+      <w:r>
+        <w:t>Whenever any brand element changes in the app:</w:t>
+      </w:r>
+    </w:p>
+    <w:p>
+      <w:r>
+        <w:t>1. This document must be updated immediately</w:t>
+      </w:r>
+    </w:p>
+    <w:p>
+      <w:r>
+        <w:t>2. CLAUDE.md in the repo must be updated</w:t>
+      </w:r>
+    </w:p>
+    <w:p>
+      <w:r>
+        <w:t>3. SOUL.md must be updated if personality is affected</w:t>
+      </w:r>
+    </w:p>
+    <w:p>
+      <w:r>
+        <w:t>4. ARCHITECTURE-DECISIONS.md must be updated for permanent decisions</w:t>
+      </w:r>
+    </w:p>
+    <w:p/>
+    <w:p>
+      <w:r>
+        <w:rPr>
+          <w:b/>
+        </w:rPr>
+        <w:t>Brand documentation must always match the live app — no exceptions.</w:t>
       </w:r>
     </w:p>
     <w:sectPr>

</xml_diff>

<commit_message>
docs(brand): add light mode surfaces, glow system, AI coach format, notification tiers
Closes documentation gap between brand kit and dashboard v2 spec.
All four new sections derived from docs/TRANSFORMR-DASHBOARD-V2-SPEC.md
(commit 6e67e0f).

[locked-edit-approved]

Co-Authored-By: Claude Opus 4.6 <noreply@anthropic.com>
</commit_message>
<xml_diff>
--- a/apps/mobile/TRANSFORMR-Brand-Identity-Kit.docx
+++ b/apps/mobile/TRANSFORMR-Brand-Identity-Kit.docx
@@ -11030,6 +11030,1897 @@
           <w:b/>
         </w:rPr>
         <w:t>Brand documentation must always match the live app — no exceptions.</w:t>
+      </w:r>
+    </w:p>
+    <w:p/>
+    <w:p>
+      <w:r>
+        <w:rPr>
+          <w:b/>
+          <w:color w:val="7C3AED"/>
+          <w:sz w:val="30"/>
+        </w:rPr>
+        <w:t>16. LIGHT MODE APP SURFACES</w:t>
+      </w:r>
+    </w:p>
+    <w:p/>
+    <w:p>
+      <w:r>
+        <w:rPr>
+          <w:sz w:val="21"/>
+        </w:rPr>
+        <w:t>The light theme is warm lavender-cream, not white. Cards are pure white to maximize contrast against the warm background. Brand colors darken slightly in light mode to maintain WCAG AA contrast ratios.</w:t>
+      </w:r>
+    </w:p>
+    <w:p/>
+    <w:p>
+      <w:r>
+        <w:rPr>
+          <w:b/>
+          <w:color w:val="2D1B69"/>
+          <w:sz w:val="26"/>
+        </w:rPr>
+        <w:t>Light Mode App Surfaces</w:t>
+      </w:r>
+    </w:p>
+    <w:tbl>
+      <w:tblPr>
+        <w:tblW w:type="auto" w:w="0"/>
+        <w:tblLook w:firstColumn="1" w:firstRow="1" w:lastColumn="0" w:lastRow="0" w:noHBand="0" w:noVBand="1" w:val="04A0"/>
+      </w:tblPr>
+      <w:tblGrid>
+        <w:gridCol w:w="3120"/>
+        <w:gridCol w:w="3120"/>
+        <w:gridCol w:w="3120"/>
+      </w:tblGrid>
+      <w:tr>
+        <w:tc>
+          <w:tcPr>
+            <w:tcW w:type="dxa" w:w="3120"/>
+          </w:tcPr>
+          <w:p>
+            <w:r/>
+            <w:r>
+              <w:rPr>
+                <w:b/>
+                <w:sz w:val="20"/>
+              </w:rPr>
+              <w:t>Token</w:t>
+            </w:r>
+          </w:p>
+        </w:tc>
+        <w:tc>
+          <w:tcPr>
+            <w:tcW w:type="dxa" w:w="3120"/>
+          </w:tcPr>
+          <w:p>
+            <w:r/>
+            <w:r>
+              <w:rPr>
+                <w:b/>
+                <w:sz w:val="20"/>
+              </w:rPr>
+              <w:t>Hex</w:t>
+            </w:r>
+          </w:p>
+        </w:tc>
+        <w:tc>
+          <w:tcPr>
+            <w:tcW w:type="dxa" w:w="3120"/>
+          </w:tcPr>
+          <w:p>
+            <w:r/>
+            <w:r>
+              <w:rPr>
+                <w:b/>
+                <w:sz w:val="20"/>
+              </w:rPr>
+              <w:t>Use</w:t>
+            </w:r>
+          </w:p>
+        </w:tc>
+      </w:tr>
+      <w:tr>
+        <w:tc>
+          <w:tcPr>
+            <w:tcW w:type="dxa" w:w="3120"/>
+          </w:tcPr>
+          <w:p>
+            <w:r/>
+            <w:r>
+              <w:rPr>
+                <w:sz w:val="18"/>
+              </w:rPr>
+              <w:t>Background Primary</w:t>
+            </w:r>
+          </w:p>
+        </w:tc>
+        <w:tc>
+          <w:tcPr>
+            <w:tcW w:type="dxa" w:w="3120"/>
+          </w:tcPr>
+          <w:p>
+            <w:r/>
+            <w:r>
+              <w:rPr>
+                <w:sz w:val="18"/>
+              </w:rPr>
+              <w:t>#F3EDE8</w:t>
+            </w:r>
+          </w:p>
+        </w:tc>
+        <w:tc>
+          <w:tcPr>
+            <w:tcW w:type="dxa" w:w="3120"/>
+          </w:tcPr>
+          <w:p>
+            <w:r/>
+            <w:r>
+              <w:rPr>
+                <w:sz w:val="18"/>
+              </w:rPr>
+              <w:t>Main app background — lavender-cream</w:t>
+            </w:r>
+          </w:p>
+        </w:tc>
+      </w:tr>
+      <w:tr>
+        <w:tc>
+          <w:tcPr>
+            <w:tcW w:type="dxa" w:w="3120"/>
+          </w:tcPr>
+          <w:p>
+            <w:r/>
+            <w:r>
+              <w:rPr>
+                <w:sz w:val="18"/>
+              </w:rPr>
+              <w:t>Background Cards</w:t>
+            </w:r>
+          </w:p>
+        </w:tc>
+        <w:tc>
+          <w:tcPr>
+            <w:tcW w:type="dxa" w:w="3120"/>
+          </w:tcPr>
+          <w:p>
+            <w:r/>
+            <w:r>
+              <w:rPr>
+                <w:sz w:val="18"/>
+              </w:rPr>
+              <w:t>#FFFFFF</w:t>
+            </w:r>
+          </w:p>
+        </w:tc>
+        <w:tc>
+          <w:tcPr>
+            <w:tcW w:type="dxa" w:w="3120"/>
+          </w:tcPr>
+          <w:p>
+            <w:r/>
+            <w:r>
+              <w:rPr>
+                <w:sz w:val="18"/>
+              </w:rPr>
+              <w:t>Card surfaces — pure white</w:t>
+            </w:r>
+          </w:p>
+        </w:tc>
+      </w:tr>
+      <w:tr>
+        <w:tc>
+          <w:tcPr>
+            <w:tcW w:type="dxa" w:w="3120"/>
+          </w:tcPr>
+          <w:p>
+            <w:r/>
+            <w:r>
+              <w:rPr>
+                <w:sz w:val="18"/>
+              </w:rPr>
+              <w:t>Background Tertiary</w:t>
+            </w:r>
+          </w:p>
+        </w:tc>
+        <w:tc>
+          <w:tcPr>
+            <w:tcW w:type="dxa" w:w="3120"/>
+          </w:tcPr>
+          <w:p>
+            <w:r/>
+            <w:r>
+              <w:rPr>
+                <w:sz w:val="18"/>
+              </w:rPr>
+              <w:t>#F8F4F0</w:t>
+            </w:r>
+          </w:p>
+        </w:tc>
+        <w:tc>
+          <w:tcPr>
+            <w:tcW w:type="dxa" w:w="3120"/>
+          </w:tcPr>
+          <w:p>
+            <w:r/>
+            <w:r>
+              <w:rPr>
+                <w:sz w:val="18"/>
+              </w:rPr>
+              <w:t>Elevated surface (modals, sheets)</w:t>
+            </w:r>
+          </w:p>
+        </w:tc>
+      </w:tr>
+      <w:tr>
+        <w:tc>
+          <w:tcPr>
+            <w:tcW w:type="dxa" w:w="3120"/>
+          </w:tcPr>
+          <w:p>
+            <w:r/>
+            <w:r>
+              <w:rPr>
+                <w:sz w:val="18"/>
+              </w:rPr>
+              <w:t>Text Primary</w:t>
+            </w:r>
+          </w:p>
+        </w:tc>
+        <w:tc>
+          <w:tcPr>
+            <w:tcW w:type="dxa" w:w="3120"/>
+          </w:tcPr>
+          <w:p>
+            <w:r/>
+            <w:r>
+              <w:rPr>
+                <w:sz w:val="18"/>
+              </w:rPr>
+              <w:t>#1A1530</w:t>
+            </w:r>
+          </w:p>
+        </w:tc>
+        <w:tc>
+          <w:tcPr>
+            <w:tcW w:type="dxa" w:w="3120"/>
+          </w:tcPr>
+          <w:p>
+            <w:r/>
+            <w:r>
+              <w:rPr>
+                <w:sz w:val="18"/>
+              </w:rPr>
+              <w:t>Body copy, headings — purple-black</w:t>
+            </w:r>
+          </w:p>
+        </w:tc>
+      </w:tr>
+      <w:tr>
+        <w:tc>
+          <w:tcPr>
+            <w:tcW w:type="dxa" w:w="3120"/>
+          </w:tcPr>
+          <w:p>
+            <w:r/>
+            <w:r>
+              <w:rPr>
+                <w:sz w:val="18"/>
+              </w:rPr>
+              <w:t>Text Secondary</w:t>
+            </w:r>
+          </w:p>
+        </w:tc>
+        <w:tc>
+          <w:tcPr>
+            <w:tcW w:type="dxa" w:w="3120"/>
+          </w:tcPr>
+          <w:p>
+            <w:r/>
+            <w:r>
+              <w:rPr>
+                <w:sz w:val="18"/>
+              </w:rPr>
+              <w:t>#4A3F6B</w:t>
+            </w:r>
+          </w:p>
+        </w:tc>
+        <w:tc>
+          <w:tcPr>
+            <w:tcW w:type="dxa" w:w="3120"/>
+          </w:tcPr>
+          <w:p>
+            <w:r/>
+            <w:r>
+              <w:rPr>
+                <w:sz w:val="18"/>
+              </w:rPr>
+              <w:t>Labels, descriptions — purple-gray</w:t>
+            </w:r>
+          </w:p>
+        </w:tc>
+      </w:tr>
+      <w:tr>
+        <w:tc>
+          <w:tcPr>
+            <w:tcW w:type="dxa" w:w="3120"/>
+          </w:tcPr>
+          <w:p>
+            <w:r/>
+            <w:r>
+              <w:rPr>
+                <w:sz w:val="18"/>
+              </w:rPr>
+              <w:t>Text Muted</w:t>
+            </w:r>
+          </w:p>
+        </w:tc>
+        <w:tc>
+          <w:tcPr>
+            <w:tcW w:type="dxa" w:w="3120"/>
+          </w:tcPr>
+          <w:p>
+            <w:r/>
+            <w:r>
+              <w:rPr>
+                <w:sz w:val="18"/>
+              </w:rPr>
+              <w:t>#7B6FA0</w:t>
+            </w:r>
+          </w:p>
+        </w:tc>
+        <w:tc>
+          <w:tcPr>
+            <w:tcW w:type="dxa" w:w="3120"/>
+          </w:tcPr>
+          <w:p>
+            <w:r/>
+            <w:r>
+              <w:rPr>
+                <w:sz w:val="18"/>
+              </w:rPr>
+              <w:t>Hints, placeholders</w:t>
+            </w:r>
+          </w:p>
+        </w:tc>
+      </w:tr>
+      <w:tr>
+        <w:tc>
+          <w:tcPr>
+            <w:tcW w:type="dxa" w:w="3120"/>
+          </w:tcPr>
+          <w:p>
+            <w:r/>
+            <w:r>
+              <w:rPr>
+                <w:sz w:val="18"/>
+              </w:rPr>
+              <w:t>Separator</w:t>
+            </w:r>
+          </w:p>
+        </w:tc>
+        <w:tc>
+          <w:tcPr>
+            <w:tcW w:type="dxa" w:w="3120"/>
+          </w:tcPr>
+          <w:p>
+            <w:r/>
+            <w:r>
+              <w:rPr>
+                <w:sz w:val="18"/>
+              </w:rPr>
+              <w:t>rgba(124,58,237,0.14)</w:t>
+            </w:r>
+          </w:p>
+        </w:tc>
+        <w:tc>
+          <w:tcPr>
+            <w:tcW w:type="dxa" w:w="3120"/>
+          </w:tcPr>
+          <w:p>
+            <w:r/>
+            <w:r>
+              <w:rPr>
+                <w:sz w:val="18"/>
+              </w:rPr>
+              <w:t>Hairline dividers</w:t>
+            </w:r>
+          </w:p>
+        </w:tc>
+      </w:tr>
+      <w:tr>
+        <w:tc>
+          <w:tcPr>
+            <w:tcW w:type="dxa" w:w="3120"/>
+          </w:tcPr>
+          <w:p>
+            <w:r/>
+            <w:r>
+              <w:rPr>
+                <w:sz w:val="18"/>
+              </w:rPr>
+              <w:t>Border Default</w:t>
+            </w:r>
+          </w:p>
+        </w:tc>
+        <w:tc>
+          <w:tcPr>
+            <w:tcW w:type="dxa" w:w="3120"/>
+          </w:tcPr>
+          <w:p>
+            <w:r/>
+            <w:r>
+              <w:rPr>
+                <w:sz w:val="18"/>
+              </w:rPr>
+              <w:t>#CBC4E0</w:t>
+            </w:r>
+          </w:p>
+        </w:tc>
+        <w:tc>
+          <w:tcPr>
+            <w:tcW w:type="dxa" w:w="3120"/>
+          </w:tcPr>
+          <w:p>
+            <w:r/>
+            <w:r>
+              <w:rPr>
+                <w:sz w:val="18"/>
+              </w:rPr>
+              <w:t>Standard borders</w:t>
+            </w:r>
+          </w:p>
+        </w:tc>
+      </w:tr>
+    </w:tbl>
+    <w:p/>
+    <w:p>
+      <w:r>
+        <w:rPr>
+          <w:b/>
+          <w:color w:val="2D1B69"/>
+          <w:sz w:val="26"/>
+        </w:rPr>
+        <w:t>Light Mode Brand Colors (contrast-corrected)</w:t>
+      </w:r>
+    </w:p>
+    <w:tbl>
+      <w:tblPr>
+        <w:tblW w:type="auto" w:w="0"/>
+        <w:tblLook w:firstColumn="1" w:firstRow="1" w:lastColumn="0" w:lastRow="0" w:noHBand="0" w:noVBand="1" w:val="04A0"/>
+      </w:tblPr>
+      <w:tblGrid>
+        <w:gridCol w:w="3120"/>
+        <w:gridCol w:w="3120"/>
+        <w:gridCol w:w="3120"/>
+      </w:tblGrid>
+      <w:tr>
+        <w:tc>
+          <w:tcPr>
+            <w:tcW w:type="dxa" w:w="3120"/>
+          </w:tcPr>
+          <w:p>
+            <w:r/>
+            <w:r>
+              <w:rPr>
+                <w:b/>
+                <w:sz w:val="20"/>
+              </w:rPr>
+              <w:t>Color</w:t>
+            </w:r>
+          </w:p>
+        </w:tc>
+        <w:tc>
+          <w:tcPr>
+            <w:tcW w:type="dxa" w:w="3120"/>
+          </w:tcPr>
+          <w:p>
+            <w:r/>
+            <w:r>
+              <w:rPr>
+                <w:b/>
+                <w:sz w:val="20"/>
+              </w:rPr>
+              <w:t>Light Mode Hex</w:t>
+            </w:r>
+          </w:p>
+        </w:tc>
+        <w:tc>
+          <w:tcPr>
+            <w:tcW w:type="dxa" w:w="3120"/>
+          </w:tcPr>
+          <w:p>
+            <w:r/>
+            <w:r>
+              <w:rPr>
+                <w:b/>
+                <w:sz w:val="20"/>
+              </w:rPr>
+              <w:t>Original (Dark) Hex</w:t>
+            </w:r>
+          </w:p>
+        </w:tc>
+      </w:tr>
+      <w:tr>
+        <w:tc>
+          <w:tcPr>
+            <w:tcW w:type="dxa" w:w="3120"/>
+          </w:tcPr>
+          <w:p>
+            <w:r/>
+            <w:r>
+              <w:rPr>
+                <w:sz w:val="18"/>
+              </w:rPr>
+              <w:t>Purple</w:t>
+            </w:r>
+          </w:p>
+        </w:tc>
+        <w:tc>
+          <w:tcPr>
+            <w:tcW w:type="dxa" w:w="3120"/>
+          </w:tcPr>
+          <w:p>
+            <w:r/>
+            <w:r>
+              <w:rPr>
+                <w:sz w:val="18"/>
+              </w:rPr>
+              <w:t>#7C3AED</w:t>
+            </w:r>
+          </w:p>
+        </w:tc>
+        <w:tc>
+          <w:tcPr>
+            <w:tcW w:type="dxa" w:w="3120"/>
+          </w:tcPr>
+          <w:p>
+            <w:r/>
+            <w:r>
+              <w:rPr>
+                <w:sz w:val="18"/>
+              </w:rPr>
+              <w:t>#A855F7</w:t>
+            </w:r>
+          </w:p>
+        </w:tc>
+      </w:tr>
+      <w:tr>
+        <w:tc>
+          <w:tcPr>
+            <w:tcW w:type="dxa" w:w="3120"/>
+          </w:tcPr>
+          <w:p>
+            <w:r/>
+            <w:r>
+              <w:rPr>
+                <w:sz w:val="18"/>
+              </w:rPr>
+              <w:t>Pink</w:t>
+            </w:r>
+          </w:p>
+        </w:tc>
+        <w:tc>
+          <w:tcPr>
+            <w:tcW w:type="dxa" w:w="3120"/>
+          </w:tcPr>
+          <w:p>
+            <w:r/>
+            <w:r>
+              <w:rPr>
+                <w:sz w:val="18"/>
+              </w:rPr>
+              <w:t>#DB2777</w:t>
+            </w:r>
+          </w:p>
+        </w:tc>
+        <w:tc>
+          <w:tcPr>
+            <w:tcW w:type="dxa" w:w="3120"/>
+          </w:tcPr>
+          <w:p>
+            <w:r/>
+            <w:r>
+              <w:rPr>
+                <w:sz w:val="18"/>
+              </w:rPr>
+              <w:t>#EC4899</w:t>
+            </w:r>
+          </w:p>
+        </w:tc>
+      </w:tr>
+      <w:tr>
+        <w:tc>
+          <w:tcPr>
+            <w:tcW w:type="dxa" w:w="3120"/>
+          </w:tcPr>
+          <w:p>
+            <w:r/>
+            <w:r>
+              <w:rPr>
+                <w:sz w:val="18"/>
+              </w:rPr>
+              <w:t>Cyan</w:t>
+            </w:r>
+          </w:p>
+        </w:tc>
+        <w:tc>
+          <w:tcPr>
+            <w:tcW w:type="dxa" w:w="3120"/>
+          </w:tcPr>
+          <w:p>
+            <w:r/>
+            <w:r>
+              <w:rPr>
+                <w:sz w:val="18"/>
+              </w:rPr>
+              <w:t>#0891B2</w:t>
+            </w:r>
+          </w:p>
+        </w:tc>
+        <w:tc>
+          <w:tcPr>
+            <w:tcW w:type="dxa" w:w="3120"/>
+          </w:tcPr>
+          <w:p>
+            <w:r/>
+            <w:r>
+              <w:rPr>
+                <w:sz w:val="18"/>
+              </w:rPr>
+              <w:t>#06B6D4</w:t>
+            </w:r>
+          </w:p>
+        </w:tc>
+      </w:tr>
+      <w:tr>
+        <w:tc>
+          <w:tcPr>
+            <w:tcW w:type="dxa" w:w="3120"/>
+          </w:tcPr>
+          <w:p>
+            <w:r/>
+            <w:r>
+              <w:rPr>
+                <w:sz w:val="18"/>
+              </w:rPr>
+              <w:t>Success</w:t>
+            </w:r>
+          </w:p>
+        </w:tc>
+        <w:tc>
+          <w:tcPr>
+            <w:tcW w:type="dxa" w:w="3120"/>
+          </w:tcPr>
+          <w:p>
+            <w:r/>
+            <w:r>
+              <w:rPr>
+                <w:sz w:val="18"/>
+              </w:rPr>
+              <w:t>#059669</w:t>
+            </w:r>
+          </w:p>
+        </w:tc>
+        <w:tc>
+          <w:tcPr>
+            <w:tcW w:type="dxa" w:w="3120"/>
+          </w:tcPr>
+          <w:p>
+            <w:r/>
+            <w:r>
+              <w:rPr>
+                <w:sz w:val="18"/>
+              </w:rPr>
+              <w:t>#22C55E</w:t>
+            </w:r>
+          </w:p>
+        </w:tc>
+      </w:tr>
+      <w:tr>
+        <w:tc>
+          <w:tcPr>
+            <w:tcW w:type="dxa" w:w="3120"/>
+          </w:tcPr>
+          <w:p>
+            <w:r/>
+            <w:r>
+              <w:rPr>
+                <w:sz w:val="18"/>
+              </w:rPr>
+              <w:t>Danger</w:t>
+            </w:r>
+          </w:p>
+        </w:tc>
+        <w:tc>
+          <w:tcPr>
+            <w:tcW w:type="dxa" w:w="3120"/>
+          </w:tcPr>
+          <w:p>
+            <w:r/>
+            <w:r>
+              <w:rPr>
+                <w:sz w:val="18"/>
+              </w:rPr>
+              <w:t>#DC2626</w:t>
+            </w:r>
+          </w:p>
+        </w:tc>
+        <w:tc>
+          <w:tcPr>
+            <w:tcW w:type="dxa" w:w="3120"/>
+          </w:tcPr>
+          <w:p>
+            <w:r/>
+            <w:r>
+              <w:rPr>
+                <w:sz w:val="18"/>
+              </w:rPr>
+              <w:t>#EF4444</w:t>
+            </w:r>
+          </w:p>
+        </w:tc>
+      </w:tr>
+    </w:tbl>
+    <w:p/>
+    <w:p>
+      <w:r>
+        <w:rPr>
+          <w:sz w:val="21"/>
+        </w:rPr>
+        <w:t>The light-mode hex values are not new colors. They are darker variants of the same brand colors, contrast-corrected for the lavender-cream background. Semantic meaning is identical to dark mode.</w:t>
+      </w:r>
+    </w:p>
+    <w:p/>
+    <w:p>
+      <w:r>
+        <w:rPr>
+          <w:b/>
+          <w:color w:val="7C3AED"/>
+          <w:sz w:val="30"/>
+        </w:rPr>
+        <w:t>17. GLOW SYSTEM</w:t>
+      </w:r>
+    </w:p>
+    <w:p/>
+    <w:p>
+      <w:r>
+        <w:rPr>
+          <w:sz w:val="21"/>
+        </w:rPr>
+        <w:t>Every card on the dashboard carries a soft colored glow encoding its semantic domain. Glow color is determined by domain, not position. Most cards glow purple by default. Pink and cyan are scarce. Their scarcity makes them meaningful.</w:t>
+      </w:r>
+    </w:p>
+    <w:p/>
+    <w:p>
+      <w:r>
+        <w:rPr>
+          <w:b/>
+          <w:color w:val="2D1B69"/>
+          <w:sz w:val="26"/>
+        </w:rPr>
+        <w:t>Card Glow Assignments</w:t>
+      </w:r>
+    </w:p>
+    <w:tbl>
+      <w:tblPr>
+        <w:tblW w:type="auto" w:w="0"/>
+        <w:tblLook w:firstColumn="1" w:firstRow="1" w:lastColumn="0" w:lastRow="0" w:noHBand="0" w:noVBand="1" w:val="04A0"/>
+      </w:tblPr>
+      <w:tblGrid>
+        <w:gridCol w:w="3120"/>
+        <w:gridCol w:w="3120"/>
+        <w:gridCol w:w="3120"/>
+      </w:tblGrid>
+      <w:tr>
+        <w:tc>
+          <w:tcPr>
+            <w:tcW w:type="dxa" w:w="3120"/>
+          </w:tcPr>
+          <w:p>
+            <w:r/>
+            <w:r>
+              <w:rPr>
+                <w:b/>
+                <w:sz w:val="20"/>
+              </w:rPr>
+              <w:t>Card</w:t>
+            </w:r>
+          </w:p>
+        </w:tc>
+        <w:tc>
+          <w:tcPr>
+            <w:tcW w:type="dxa" w:w="3120"/>
+          </w:tcPr>
+          <w:p>
+            <w:r/>
+            <w:r>
+              <w:rPr>
+                <w:b/>
+                <w:sz w:val="20"/>
+              </w:rPr>
+              <w:t>Domain</w:t>
+            </w:r>
+          </w:p>
+        </w:tc>
+        <w:tc>
+          <w:tcPr>
+            <w:tcW w:type="dxa" w:w="3120"/>
+          </w:tcPr>
+          <w:p>
+            <w:r/>
+            <w:r>
+              <w:rPr>
+                <w:b/>
+                <w:sz w:val="20"/>
+              </w:rPr>
+              <w:t>Glow Color</w:t>
+            </w:r>
+          </w:p>
+        </w:tc>
+      </w:tr>
+      <w:tr>
+        <w:tc>
+          <w:tcPr>
+            <w:tcW w:type="dxa" w:w="3120"/>
+          </w:tcPr>
+          <w:p>
+            <w:r/>
+            <w:r>
+              <w:rPr>
+                <w:sz w:val="18"/>
+              </w:rPr>
+              <w:t>Hero card (4 score rings)</w:t>
+            </w:r>
+          </w:p>
+        </w:tc>
+        <w:tc>
+          <w:tcPr>
+            <w:tcW w:type="dxa" w:w="3120"/>
+          </w:tcPr>
+          <w:p>
+            <w:r/>
+            <w:r>
+              <w:rPr>
+                <w:sz w:val="18"/>
+              </w:rPr>
+              <w:t>Structure</w:t>
+            </w:r>
+          </w:p>
+        </w:tc>
+        <w:tc>
+          <w:tcPr>
+            <w:tcW w:type="dxa" w:w="3120"/>
+          </w:tcPr>
+          <w:p>
+            <w:r/>
+            <w:r>
+              <w:rPr>
+                <w:sz w:val="18"/>
+              </w:rPr>
+              <w:t>Purple</w:t>
+            </w:r>
+          </w:p>
+        </w:tc>
+      </w:tr>
+      <w:tr>
+        <w:tc>
+          <w:tcPr>
+            <w:tcW w:type="dxa" w:w="3120"/>
+          </w:tcPr>
+          <w:p>
+            <w:r/>
+            <w:r>
+              <w:rPr>
+                <w:sz w:val="18"/>
+              </w:rPr>
+              <w:t>AI Coach insight strip</w:t>
+            </w:r>
+          </w:p>
+        </w:tc>
+        <w:tc>
+          <w:tcPr>
+            <w:tcW w:type="dxa" w:w="3120"/>
+          </w:tcPr>
+          <w:p>
+            <w:r/>
+            <w:r>
+              <w:rPr>
+                <w:sz w:val="18"/>
+              </w:rPr>
+              <w:t>AI intelligence</w:t>
+            </w:r>
+          </w:p>
+        </w:tc>
+        <w:tc>
+          <w:tcPr>
+            <w:tcW w:type="dxa" w:w="3120"/>
+          </w:tcPr>
+          <w:p>
+            <w:r/>
+            <w:r>
+              <w:rPr>
+                <w:sz w:val="18"/>
+              </w:rPr>
+              <w:t>Cyan</w:t>
+            </w:r>
+          </w:p>
+        </w:tc>
+      </w:tr>
+      <w:tr>
+        <w:tc>
+          <w:tcPr>
+            <w:tcW w:type="dxa" w:w="3120"/>
+          </w:tcPr>
+          <w:p>
+            <w:r/>
+            <w:r>
+              <w:rPr>
+                <w:sz w:val="18"/>
+              </w:rPr>
+              <w:t>Couples / Bond strip</w:t>
+            </w:r>
+          </w:p>
+        </w:tc>
+        <w:tc>
+          <w:tcPr>
+            <w:tcW w:type="dxa" w:w="3120"/>
+          </w:tcPr>
+          <w:p>
+            <w:r/>
+            <w:r>
+              <w:rPr>
+                <w:sz w:val="18"/>
+              </w:rPr>
+              <w:t>Partner / celebration</w:t>
+            </w:r>
+          </w:p>
+        </w:tc>
+        <w:tc>
+          <w:tcPr>
+            <w:tcW w:type="dxa" w:w="3120"/>
+          </w:tcPr>
+          <w:p>
+            <w:r/>
+            <w:r>
+              <w:rPr>
+                <w:sz w:val="18"/>
+              </w:rPr>
+              <w:t>Pink</w:t>
+            </w:r>
+          </w:p>
+        </w:tc>
+      </w:tr>
+      <w:tr>
+        <w:tc>
+          <w:tcPr>
+            <w:tcW w:type="dxa" w:w="3120"/>
+          </w:tcPr>
+          <w:p>
+            <w:r/>
+            <w:r>
+              <w:rPr>
+                <w:sz w:val="18"/>
+              </w:rPr>
+              <w:t>Stake Goal</w:t>
+            </w:r>
+          </w:p>
+        </w:tc>
+        <w:tc>
+          <w:tcPr>
+            <w:tcW w:type="dxa" w:w="3120"/>
+          </w:tcPr>
+          <w:p>
+            <w:r/>
+            <w:r>
+              <w:rPr>
+                <w:sz w:val="18"/>
+              </w:rPr>
+              <w:t>Achievement / wins</w:t>
+            </w:r>
+          </w:p>
+        </w:tc>
+        <w:tc>
+          <w:tcPr>
+            <w:tcW w:type="dxa" w:w="3120"/>
+          </w:tcPr>
+          <w:p>
+            <w:r/>
+            <w:r>
+              <w:rPr>
+                <w:sz w:val="18"/>
+              </w:rPr>
+              <w:t>Pink</w:t>
+            </w:r>
+          </w:p>
+        </w:tc>
+      </w:tr>
+      <w:tr>
+        <w:tc>
+          <w:tcPr>
+            <w:tcW w:type="dxa" w:w="3120"/>
+          </w:tcPr>
+          <w:p>
+            <w:r/>
+            <w:r>
+              <w:rPr>
+                <w:sz w:val="18"/>
+              </w:rPr>
+              <w:t>Today’s Habits</w:t>
+            </w:r>
+          </w:p>
+        </w:tc>
+        <w:tc>
+          <w:tcPr>
+            <w:tcW w:type="dxa" w:w="3120"/>
+          </w:tcPr>
+          <w:p>
+            <w:r/>
+            <w:r>
+              <w:rPr>
+                <w:sz w:val="18"/>
+              </w:rPr>
+              <w:t>Structure</w:t>
+            </w:r>
+          </w:p>
+        </w:tc>
+        <w:tc>
+          <w:tcPr>
+            <w:tcW w:type="dxa" w:w="3120"/>
+          </w:tcPr>
+          <w:p>
+            <w:r/>
+            <w:r>
+              <w:rPr>
+                <w:sz w:val="18"/>
+              </w:rPr>
+              <w:t>Purple</w:t>
+            </w:r>
+          </w:p>
+        </w:tc>
+      </w:tr>
+      <w:tr>
+        <w:tc>
+          <w:tcPr>
+            <w:tcW w:type="dxa" w:w="3120"/>
+          </w:tcPr>
+          <w:p>
+            <w:r/>
+            <w:r>
+              <w:rPr>
+                <w:sz w:val="18"/>
+              </w:rPr>
+              <w:t>Weight, Revenue, Sleep, Deep Work</w:t>
+            </w:r>
+          </w:p>
+        </w:tc>
+        <w:tc>
+          <w:tcPr>
+            <w:tcW w:type="dxa" w:w="3120"/>
+          </w:tcPr>
+          <w:p>
+            <w:r/>
+            <w:r>
+              <w:rPr>
+                <w:sz w:val="18"/>
+              </w:rPr>
+              <w:t>Structure</w:t>
+            </w:r>
+          </w:p>
+        </w:tc>
+        <w:tc>
+          <w:tcPr>
+            <w:tcW w:type="dxa" w:w="3120"/>
+          </w:tcPr>
+          <w:p>
+            <w:r/>
+            <w:r>
+              <w:rPr>
+                <w:sz w:val="18"/>
+              </w:rPr>
+              <w:t>Purple</w:t>
+            </w:r>
+          </w:p>
+        </w:tc>
+      </w:tr>
+      <w:tr>
+        <w:tc>
+          <w:tcPr>
+            <w:tcW w:type="dxa" w:w="3120"/>
+          </w:tcPr>
+          <w:p>
+            <w:r/>
+            <w:r>
+              <w:rPr>
+                <w:sz w:val="18"/>
+              </w:rPr>
+              <w:t>Body↔Wealth Correlation card</w:t>
+            </w:r>
+          </w:p>
+        </w:tc>
+        <w:tc>
+          <w:tcPr>
+            <w:tcW w:type="dxa" w:w="3120"/>
+          </w:tcPr>
+          <w:p>
+            <w:r/>
+            <w:r>
+              <w:rPr>
+                <w:sz w:val="18"/>
+              </w:rPr>
+              <w:t>AI intelligence</w:t>
+            </w:r>
+          </w:p>
+        </w:tc>
+        <w:tc>
+          <w:tcPr>
+            <w:tcW w:type="dxa" w:w="3120"/>
+          </w:tcPr>
+          <w:p>
+            <w:r/>
+            <w:r>
+              <w:rPr>
+                <w:sz w:val="18"/>
+              </w:rPr>
+              <w:t>Cyan</w:t>
+            </w:r>
+          </w:p>
+        </w:tc>
+      </w:tr>
+    </w:tbl>
+    <w:p/>
+    <w:p>
+      <w:r>
+        <w:rPr>
+          <w:b/>
+          <w:color w:val="2D1B69"/>
+          <w:sz w:val="26"/>
+        </w:rPr>
+        <w:t>Glow Specifications (Light Mode)</w:t>
+      </w:r>
+    </w:p>
+    <w:tbl>
+      <w:tblPr>
+        <w:tblW w:type="auto" w:w="0"/>
+        <w:tblLook w:firstColumn="1" w:firstRow="1" w:lastColumn="0" w:lastRow="0" w:noHBand="0" w:noVBand="1" w:val="04A0"/>
+      </w:tblPr>
+      <w:tblGrid>
+        <w:gridCol w:w="4680"/>
+        <w:gridCol w:w="4680"/>
+      </w:tblGrid>
+      <w:tr>
+        <w:tc>
+          <w:tcPr>
+            <w:tcW w:type="dxa" w:w="4680"/>
+          </w:tcPr>
+          <w:p>
+            <w:r/>
+            <w:r>
+              <w:rPr>
+                <w:b/>
+                <w:sz w:val="20"/>
+              </w:rPr>
+              <w:t>Domain</w:t>
+            </w:r>
+          </w:p>
+        </w:tc>
+        <w:tc>
+          <w:tcPr>
+            <w:tcW w:type="dxa" w:w="4680"/>
+          </w:tcPr>
+          <w:p>
+            <w:r/>
+            <w:r>
+              <w:rPr>
+                <w:b/>
+                <w:sz w:val="20"/>
+              </w:rPr>
+              <w:t>Box-shadow value</w:t>
+            </w:r>
+          </w:p>
+        </w:tc>
+      </w:tr>
+      <w:tr>
+        <w:tc>
+          <w:tcPr>
+            <w:tcW w:type="dxa" w:w="4680"/>
+          </w:tcPr>
+          <w:p>
+            <w:r/>
+            <w:r>
+              <w:rPr>
+                <w:sz w:val="18"/>
+              </w:rPr>
+              <w:t>Purple</w:t>
+            </w:r>
+          </w:p>
+        </w:tc>
+        <w:tc>
+          <w:tcPr>
+            <w:tcW w:type="dxa" w:w="4680"/>
+          </w:tcPr>
+          <w:p>
+            <w:r/>
+            <w:r>
+              <w:rPr>
+                <w:sz w:val="18"/>
+              </w:rPr>
+              <w:t>0 6px 22px rgba(124, 58, 237, 0.20), 0 2px 6px rgba(45, 27, 105, 0.08)</w:t>
+            </w:r>
+          </w:p>
+        </w:tc>
+      </w:tr>
+      <w:tr>
+        <w:tc>
+          <w:tcPr>
+            <w:tcW w:type="dxa" w:w="4680"/>
+          </w:tcPr>
+          <w:p>
+            <w:r/>
+            <w:r>
+              <w:rPr>
+                <w:sz w:val="18"/>
+              </w:rPr>
+              <w:t>Pink</w:t>
+            </w:r>
+          </w:p>
+        </w:tc>
+        <w:tc>
+          <w:tcPr>
+            <w:tcW w:type="dxa" w:w="4680"/>
+          </w:tcPr>
+          <w:p>
+            <w:r/>
+            <w:r>
+              <w:rPr>
+                <w:sz w:val="18"/>
+              </w:rPr>
+              <w:t>0 6px 22px rgba(219, 39, 119, 0.22), 0 2px 6px rgba(45, 27, 105, 0.08)</w:t>
+            </w:r>
+          </w:p>
+        </w:tc>
+      </w:tr>
+      <w:tr>
+        <w:tc>
+          <w:tcPr>
+            <w:tcW w:type="dxa" w:w="4680"/>
+          </w:tcPr>
+          <w:p>
+            <w:r/>
+            <w:r>
+              <w:rPr>
+                <w:sz w:val="18"/>
+              </w:rPr>
+              <w:t>Cyan</w:t>
+            </w:r>
+          </w:p>
+        </w:tc>
+        <w:tc>
+          <w:tcPr>
+            <w:tcW w:type="dxa" w:w="4680"/>
+          </w:tcPr>
+          <w:p>
+            <w:r/>
+            <w:r>
+              <w:rPr>
+                <w:sz w:val="18"/>
+              </w:rPr>
+              <w:t>0 6px 22px rgba(8, 145, 178, 0.24), 0 2px 6px rgba(45, 27, 105, 0.08)</w:t>
+            </w:r>
+          </w:p>
+        </w:tc>
+      </w:tr>
+    </w:tbl>
+    <w:p/>
+    <w:p>
+      <w:r>
+        <w:rPr>
+          <w:b/>
+          <w:color w:val="2D1B69"/>
+          <w:sz w:val="26"/>
+        </w:rPr>
+        <w:t>Glow Specifications (Dark Mode)</w:t>
+      </w:r>
+    </w:p>
+    <w:tbl>
+      <w:tblPr>
+        <w:tblW w:type="auto" w:w="0"/>
+        <w:tblLook w:firstColumn="1" w:firstRow="1" w:lastColumn="0" w:lastRow="0" w:noHBand="0" w:noVBand="1" w:val="04A0"/>
+      </w:tblPr>
+      <w:tblGrid>
+        <w:gridCol w:w="4680"/>
+        <w:gridCol w:w="4680"/>
+      </w:tblGrid>
+      <w:tr>
+        <w:tc>
+          <w:tcPr>
+            <w:tcW w:type="dxa" w:w="4680"/>
+          </w:tcPr>
+          <w:p>
+            <w:r/>
+            <w:r>
+              <w:rPr>
+                <w:b/>
+                <w:sz w:val="20"/>
+              </w:rPr>
+              <w:t>Domain</w:t>
+            </w:r>
+          </w:p>
+        </w:tc>
+        <w:tc>
+          <w:tcPr>
+            <w:tcW w:type="dxa" w:w="4680"/>
+          </w:tcPr>
+          <w:p>
+            <w:r/>
+            <w:r>
+              <w:rPr>
+                <w:b/>
+                <w:sz w:val="20"/>
+              </w:rPr>
+              <w:t>Box-shadow value</w:t>
+            </w:r>
+          </w:p>
+        </w:tc>
+      </w:tr>
+      <w:tr>
+        <w:tc>
+          <w:tcPr>
+            <w:tcW w:type="dxa" w:w="4680"/>
+          </w:tcPr>
+          <w:p>
+            <w:r/>
+            <w:r>
+              <w:rPr>
+                <w:sz w:val="18"/>
+              </w:rPr>
+              <w:t>Purple</w:t>
+            </w:r>
+          </w:p>
+        </w:tc>
+        <w:tc>
+          <w:tcPr>
+            <w:tcW w:type="dxa" w:w="4680"/>
+          </w:tcPr>
+          <w:p>
+            <w:r/>
+            <w:r>
+              <w:rPr>
+                <w:sz w:val="18"/>
+              </w:rPr>
+              <w:t>0 0 0 0.5px rgba(168, 85, 247, 0.30), 0 6px 24px rgba(168, 85, 247, 0.20), 0 2px 8px rgba(0,0,0,0.4)</w:t>
+            </w:r>
+          </w:p>
+        </w:tc>
+      </w:tr>
+      <w:tr>
+        <w:tc>
+          <w:tcPr>
+            <w:tcW w:type="dxa" w:w="4680"/>
+          </w:tcPr>
+          <w:p>
+            <w:r/>
+            <w:r>
+              <w:rPr>
+                <w:sz w:val="18"/>
+              </w:rPr>
+              <w:t>Pink</w:t>
+            </w:r>
+          </w:p>
+        </w:tc>
+        <w:tc>
+          <w:tcPr>
+            <w:tcW w:type="dxa" w:w="4680"/>
+          </w:tcPr>
+          <w:p>
+            <w:r/>
+            <w:r>
+              <w:rPr>
+                <w:sz w:val="18"/>
+              </w:rPr>
+              <w:t>0 0 0 0.5px rgba(236, 72, 153, 0.30), 0 6px 24px rgba(236, 72, 153, 0.22), 0 2px 8px rgba(0,0,0,0.4)</w:t>
+            </w:r>
+          </w:p>
+        </w:tc>
+      </w:tr>
+      <w:tr>
+        <w:tc>
+          <w:tcPr>
+            <w:tcW w:type="dxa" w:w="4680"/>
+          </w:tcPr>
+          <w:p>
+            <w:r/>
+            <w:r>
+              <w:rPr>
+                <w:sz w:val="18"/>
+              </w:rPr>
+              <w:t>Cyan</w:t>
+            </w:r>
+          </w:p>
+        </w:tc>
+        <w:tc>
+          <w:tcPr>
+            <w:tcW w:type="dxa" w:w="4680"/>
+          </w:tcPr>
+          <w:p>
+            <w:r/>
+            <w:r>
+              <w:rPr>
+                <w:sz w:val="18"/>
+              </w:rPr>
+              <w:t>0 0 0 0.5px rgba(6, 182, 212, 0.30), 0 6px 24px rgba(6, 182, 212, 0.24), 0 2px 8px rgba(0,0,0,0.4)</w:t>
+            </w:r>
+          </w:p>
+        </w:tc>
+      </w:tr>
+    </w:tbl>
+    <w:p/>
+    <w:p>
+      <w:r>
+        <w:rPr>
+          <w:sz w:val="21"/>
+        </w:rPr>
+        <w:t>Cyan glows are slightly more intense than purple/pink because cyan is naturally less saturated to the eye. The dark-mode 0.5px hairline provides edge definition against Deep Space backgrounds.</w:t>
+      </w:r>
+    </w:p>
+    <w:p/>
+    <w:p>
+      <w:r>
+        <w:rPr>
+          <w:b/>
+          <w:color w:val="7C3AED"/>
+          <w:sz w:val="30"/>
+        </w:rPr>
+        <w:t>18. AI COACH FORMAT</w:t>
+      </w:r>
+    </w:p>
+    <w:p/>
+    <w:p>
+      <w:r>
+        <w:rPr>
+          <w:sz w:val="21"/>
+        </w:rPr>
+        <w:t>All AI Coach insights generated by Claude follow a strict three-part format. This format is enforced by the Edge Function system prompt, not by client-side parsing. Generic advice is unacceptable. Every insight must reference the user’s actual data.</w:t>
+      </w:r>
+    </w:p>
+    <w:p/>
+    <w:p>
+      <w:r>
+        <w:rPr>
+          <w:b/>
+          <w:color w:val="2D1B69"/>
+          <w:sz w:val="26"/>
+        </w:rPr>
+        <w:t>AI Coach Three-Part Format</w:t>
+      </w:r>
+    </w:p>
+    <w:tbl>
+      <w:tblPr>
+        <w:tblW w:type="auto" w:w="0"/>
+        <w:tblLook w:firstColumn="1" w:firstRow="1" w:lastColumn="0" w:lastRow="0" w:noHBand="0" w:noVBand="1" w:val="04A0"/>
+      </w:tblPr>
+      <w:tblGrid>
+        <w:gridCol w:w="3120"/>
+        <w:gridCol w:w="3120"/>
+        <w:gridCol w:w="3120"/>
+      </w:tblGrid>
+      <w:tr>
+        <w:tc>
+          <w:tcPr>
+            <w:tcW w:type="dxa" w:w="3120"/>
+          </w:tcPr>
+          <w:p>
+            <w:r/>
+            <w:r>
+              <w:rPr>
+                <w:b/>
+                <w:sz w:val="20"/>
+              </w:rPr>
+              <w:t>Part</w:t>
+            </w:r>
+          </w:p>
+        </w:tc>
+        <w:tc>
+          <w:tcPr>
+            <w:tcW w:type="dxa" w:w="3120"/>
+          </w:tcPr>
+          <w:p>
+            <w:r/>
+            <w:r>
+              <w:rPr>
+                <w:b/>
+                <w:sz w:val="20"/>
+              </w:rPr>
+              <w:t>Purpose</w:t>
+            </w:r>
+          </w:p>
+        </w:tc>
+        <w:tc>
+          <w:tcPr>
+            <w:tcW w:type="dxa" w:w="3120"/>
+          </w:tcPr>
+          <w:p>
+            <w:r/>
+            <w:r>
+              <w:rPr>
+                <w:b/>
+                <w:sz w:val="20"/>
+              </w:rPr>
+              <w:t>Example</w:t>
+            </w:r>
+          </w:p>
+        </w:tc>
+      </w:tr>
+      <w:tr>
+        <w:tc>
+          <w:tcPr>
+            <w:tcW w:type="dxa" w:w="3120"/>
+          </w:tcPr>
+          <w:p>
+            <w:r/>
+            <w:r>
+              <w:rPr>
+                <w:sz w:val="18"/>
+              </w:rPr>
+              <w:t>You’re winning at</w:t>
+            </w:r>
+          </w:p>
+        </w:tc>
+        <w:tc>
+          <w:tcPr>
+            <w:tcW w:type="dxa" w:w="3120"/>
+          </w:tcPr>
+          <w:p>
+            <w:r/>
+            <w:r>
+              <w:rPr>
+                <w:sz w:val="18"/>
+              </w:rPr>
+              <w:t>Acknowledge what’s working</w:t>
+            </w:r>
+          </w:p>
+        </w:tc>
+        <w:tc>
+          <w:tcPr>
+            <w:tcW w:type="dxa" w:w="3120"/>
+          </w:tcPr>
+          <w:p>
+            <w:r/>
+            <w:r>
+              <w:rPr>
+                <w:sz w:val="18"/>
+              </w:rPr>
+              <w:t>“nutrition (5/5 days on target)”</w:t>
+            </w:r>
+          </w:p>
+        </w:tc>
+      </w:tr>
+      <w:tr>
+        <w:tc>
+          <w:tcPr>
+            <w:tcW w:type="dxa" w:w="3120"/>
+          </w:tcPr>
+          <w:p>
+            <w:r/>
+            <w:r>
+              <w:rPr>
+                <w:sz w:val="18"/>
+              </w:rPr>
+              <w:t>Focus on</w:t>
+            </w:r>
+          </w:p>
+        </w:tc>
+        <w:tc>
+          <w:tcPr>
+            <w:tcW w:type="dxa" w:w="3120"/>
+          </w:tcPr>
+          <w:p>
+            <w:r/>
+            <w:r>
+              <w:rPr>
+                <w:sz w:val="18"/>
+              </w:rPr>
+              <w:t>Identify the weak link with specific data</w:t>
+            </w:r>
+          </w:p>
+        </w:tc>
+        <w:tc>
+          <w:tcPr>
+            <w:tcW w:type="dxa" w:w="3120"/>
+          </w:tcPr>
+          <w:p>
+            <w:r/>
+            <w:r>
+              <w:rPr>
+                <w:sz w:val="18"/>
+              </w:rPr>
+              <w:t>“sleep — 5h 17m last night”</w:t>
+            </w:r>
+          </w:p>
+        </w:tc>
+      </w:tr>
+      <w:tr>
+        <w:tc>
+          <w:tcPr>
+            <w:tcW w:type="dxa" w:w="3120"/>
+          </w:tcPr>
+          <w:p>
+            <w:r/>
+            <w:r>
+              <w:rPr>
+                <w:sz w:val="18"/>
+              </w:rPr>
+              <w:t>Try this</w:t>
+            </w:r>
+          </w:p>
+        </w:tc>
+        <w:tc>
+          <w:tcPr>
+            <w:tcW w:type="dxa" w:w="3120"/>
+          </w:tcPr>
+          <w:p>
+            <w:r/>
+            <w:r>
+              <w:rPr>
+                <w:sz w:val="18"/>
+              </w:rPr>
+              <w:t>One specific, actionable next step</w:t>
+            </w:r>
+          </w:p>
+        </w:tc>
+        <w:tc>
+          <w:tcPr>
+            <w:tcW w:type="dxa" w:w="3120"/>
+          </w:tcPr>
+          <w:p>
+            <w:r/>
+            <w:r>
+              <w:rPr>
+                <w:sz w:val="18"/>
+              </w:rPr>
+              <w:t>“lights out by 10:30 tonight, no screens after 10”</w:t>
+            </w:r>
+          </w:p>
+        </w:tc>
+      </w:tr>
+    </w:tbl>
+    <w:p/>
+    <w:p>
+      <w:r>
+        <w:rPr>
+          <w:sz w:val="21"/>
+        </w:rPr>
+        <w:t>The format adapts by time of day. Morning emphasizes the day ahead. Midday emphasizes mid-game corrections. Evening emphasizes reflection and tomorrow’s leverage. The label colors are cyan for “winning at” and pink for “focus on” to reinforce the three-color semantic system.</w:t>
+      </w:r>
+    </w:p>
+    <w:p/>
+    <w:p>
+      <w:r>
+        <w:rPr>
+          <w:b/>
+          <w:color w:val="7C3AED"/>
+          <w:sz w:val="30"/>
+        </w:rPr>
+        <w:t>19. NOTIFICATION TIERS</w:t>
+      </w:r>
+    </w:p>
+    <w:p/>
+    <w:p>
+      <w:r>
+        <w:rPr>
+          <w:sz w:val="21"/>
+        </w:rPr>
+        <w:t>Users select one of three notification tiers in settings. Default is Standard. Tiers are named for intent rather than frequency. Quiet hours 00:00–06:00 user local time are non-overridable across all tiers.</w:t>
+      </w:r>
+    </w:p>
+    <w:p/>
+    <w:p>
+      <w:r>
+        <w:rPr>
+          <w:b/>
+          <w:color w:val="2D1B69"/>
+          <w:sz w:val="26"/>
+        </w:rPr>
+        <w:t>Notification Tier Definitions</w:t>
+      </w:r>
+    </w:p>
+    <w:tbl>
+      <w:tblPr>
+        <w:tblW w:type="auto" w:w="0"/>
+        <w:tblLook w:firstColumn="1" w:firstRow="1" w:lastColumn="0" w:lastRow="0" w:noHBand="0" w:noVBand="1" w:val="04A0"/>
+      </w:tblPr>
+      <w:tblGrid>
+        <w:gridCol w:w="3120"/>
+        <w:gridCol w:w="3120"/>
+        <w:gridCol w:w="3120"/>
+      </w:tblGrid>
+      <w:tr>
+        <w:tc>
+          <w:tcPr>
+            <w:tcW w:type="dxa" w:w="3120"/>
+          </w:tcPr>
+          <w:p>
+            <w:r/>
+            <w:r>
+              <w:rPr>
+                <w:b/>
+                <w:sz w:val="20"/>
+              </w:rPr>
+              <w:t>Tier</w:t>
+            </w:r>
+          </w:p>
+        </w:tc>
+        <w:tc>
+          <w:tcPr>
+            <w:tcW w:type="dxa" w:w="3120"/>
+          </w:tcPr>
+          <w:p>
+            <w:r/>
+            <w:r>
+              <w:rPr>
+                <w:b/>
+                <w:sz w:val="20"/>
+              </w:rPr>
+              <w:t>Volume</w:t>
+            </w:r>
+          </w:p>
+        </w:tc>
+        <w:tc>
+          <w:tcPr>
+            <w:tcW w:type="dxa" w:w="3120"/>
+          </w:tcPr>
+          <w:p>
+            <w:r/>
+            <w:r>
+              <w:rPr>
+                <w:b/>
+                <w:sz w:val="20"/>
+              </w:rPr>
+              <w:t>Includes</w:t>
+            </w:r>
+          </w:p>
+        </w:tc>
+      </w:tr>
+      <w:tr>
+        <w:tc>
+          <w:tcPr>
+            <w:tcW w:type="dxa" w:w="3120"/>
+          </w:tcPr>
+          <w:p>
+            <w:r/>
+            <w:r>
+              <w:rPr>
+                <w:sz w:val="18"/>
+              </w:rPr>
+              <w:t>Quiet</w:t>
+            </w:r>
+          </w:p>
+        </w:tc>
+        <w:tc>
+          <w:tcPr>
+            <w:tcW w:type="dxa" w:w="3120"/>
+          </w:tcPr>
+          <w:p>
+            <w:r/>
+            <w:r>
+              <w:rPr>
+                <w:sz w:val="18"/>
+              </w:rPr>
+              <w:t>~1–2 per day</w:t>
+            </w:r>
+          </w:p>
+        </w:tc>
+        <w:tc>
+          <w:tcPr>
+            <w:tcW w:type="dxa" w:w="3120"/>
+          </w:tcPr>
+          <w:p>
+            <w:r/>
+            <w:r>
+              <w:rPr>
+                <w:sz w:val="18"/>
+              </w:rPr>
+              <w:t>Streak at risk, partner nudges received, stake-goal critical only</w:t>
+            </w:r>
+          </w:p>
+        </w:tc>
+      </w:tr>
+      <w:tr>
+        <w:tc>
+          <w:tcPr>
+            <w:tcW w:type="dxa" w:w="3120"/>
+          </w:tcPr>
+          <w:p>
+            <w:r/>
+            <w:r>
+              <w:rPr>
+                <w:sz w:val="18"/>
+              </w:rPr>
+              <w:t>Standard</w:t>
+            </w:r>
+          </w:p>
+        </w:tc>
+        <w:tc>
+          <w:tcPr>
+            <w:tcW w:type="dxa" w:w="3120"/>
+          </w:tcPr>
+          <w:p>
+            <w:r/>
+            <w:r>
+              <w:rPr>
+                <w:sz w:val="18"/>
+              </w:rPr>
+              <w:t>~4–6 per day</w:t>
+            </w:r>
+          </w:p>
+        </w:tc>
+        <w:tc>
+          <w:tcPr>
+            <w:tcW w:type="dxa" w:w="3120"/>
+          </w:tcPr>
+          <w:p>
+            <w:r/>
+            <w:r>
+              <w:rPr>
+                <w:sz w:val="18"/>
+              </w:rPr>
+              <w:t>All Quiet plus morning briefing, meal reminders, evening check-in, weekly review, achievements</w:t>
+            </w:r>
+          </w:p>
+        </w:tc>
+      </w:tr>
+      <w:tr>
+        <w:tc>
+          <w:tcPr>
+            <w:tcW w:type="dxa" w:w="3120"/>
+          </w:tcPr>
+          <w:p>
+            <w:r/>
+            <w:r>
+              <w:rPr>
+                <w:sz w:val="18"/>
+              </w:rPr>
+              <w:t>Coach</w:t>
+            </w:r>
+          </w:p>
+        </w:tc>
+        <w:tc>
+          <w:tcPr>
+            <w:tcW w:type="dxa" w:w="3120"/>
+          </w:tcPr>
+          <w:p>
+            <w:r/>
+            <w:r>
+              <w:rPr>
+                <w:sz w:val="18"/>
+              </w:rPr>
+              <w:t>~12–15 per day</w:t>
+            </w:r>
+          </w:p>
+        </w:tc>
+        <w:tc>
+          <w:tcPr>
+            <w:tcW w:type="dxa" w:w="3120"/>
+          </w:tcPr>
+          <w:p>
+            <w:r/>
+            <w:r>
+              <w:rPr>
+                <w:sz w:val="18"/>
+              </w:rPr>
+              <w:t>All Standard plus hourly water, mid-meal protein nudges, pre/post-workout reminders, energy checks, wind-down prompts, partner activity nudges, approaching-PR alerts</w:t>
+            </w:r>
+          </w:p>
+        </w:tc>
+      </w:tr>
+    </w:tbl>
+    <w:p/>
+    <w:p>
+      <w:r>
+        <w:rPr>
+          <w:sz w:val="21"/>
+        </w:rPr>
+        <w:t>Default tier is Standard. Coach tier is opt-in only. Aggressive defaults destroy retention. Apple has rejected apps for spammy notification patterns. Notification permission is requested contextually after the user has engaged with the app, never on first launch.</w:t>
       </w:r>
     </w:p>
     <w:sectPr>

</xml_diff>